<commit_message>
Q2+Q3+Q4 in-place: chen 12 ref MOI verified (Bie/Salari/Erskine/Pham/Nguyen/V-NAMHS/Schlechter/Cervin/Sideridis/Appelbaum/Nosek/vanAkker) — Q3 17 body cite + 12 refs append, Q4 8 body cite + 8 refs append, Q2 5 refs append (no body cite — published-style)
</commit_message>
<xml_diff>
--- a/bai-bao-Q1/Draft_Q2_SongNgu_v1_07062026.docx
+++ b/bai-bao-Q1/Draft_Q2_SongNgu_v1_07062026.docx
@@ -3772,6 +3772,71 @@
     </w:p>
     <w:p>
       <w:pPr>
+        <w:spacing w:after="80"/>
+        <w:ind w:left="397" w:hanging="397"/>
+      </w:pPr>
+      <w:r>
+        <w:rPr>
+          <w:rFonts w:ascii="Times New Roman" w:hAnsi="Times New Roman"/>
+          <w:sz w:val="20"/>
+        </w:rPr>
+        <w:t>36. Bie F, Yan X, Xing J, et al. Rising global burden of anxiety disorders among adolescents and young adults: trends, risk factors, and the impact of socioeconomic disparities and COVID-19 from 1990 to 2021. Front Psychiatry. 2024;15:1489427. PMID: 39691785. DOI: 10.3389/fpsyt.2024.1489427.</w:t>
+      </w:r>
+    </w:p>
+    <w:p>
+      <w:pPr>
+        <w:spacing w:after="80"/>
+        <w:ind w:left="397" w:hanging="397"/>
+      </w:pPr>
+      <w:r>
+        <w:rPr>
+          <w:rFonts w:ascii="Times New Roman" w:hAnsi="Times New Roman"/>
+          <w:sz w:val="20"/>
+        </w:rPr>
+        <w:t>37. Pham TTH, Do TT, Nguyen TL, Ngo AV. Anxiety symptoms and coping strategies among high school students in Vietnam after COVID-19 pandemic: a mixed-method evaluation. Front Public Health. 2024;12:1232856. PMID: 38435293. DOI: 10.3389/fpubh.2024.1232856.</w:t>
+      </w:r>
+    </w:p>
+    <w:p>
+      <w:pPr>
+        <w:spacing w:after="80"/>
+        <w:ind w:left="397" w:hanging="397"/>
+      </w:pPr>
+      <w:r>
+        <w:rPr>
+          <w:rFonts w:ascii="Times New Roman" w:hAnsi="Times New Roman"/>
+          <w:sz w:val="20"/>
+        </w:rPr>
+        <w:t>38. Vietnam Institute of Sociology, University of Queensland, Johns Hopkins Bloomberg School of Public Health. Viet Nam Adolescent Mental Health Survey (V-NAMHS): Report on Main Findings. Hanoi: Institute of Sociology; 2022.</w:t>
+      </w:r>
+    </w:p>
+    <w:p>
+      <w:pPr>
+        <w:spacing w:after="80"/>
+        <w:ind w:left="397" w:hanging="397"/>
+      </w:pPr>
+      <w:r>
+        <w:rPr>
+          <w:rFonts w:ascii="Times New Roman" w:hAnsi="Times New Roman"/>
+          <w:sz w:val="20"/>
+        </w:rPr>
+        <w:t>39. Appelbaum M, Cooper H, Kline RB, Mayo-Wilson E, Nezu AM, Rao SM. Journal article reporting standards for quantitative research in psychology. Am Psychol. 2018;73(1):3-25. PMID: 29345484. DOI: 10.1037/amp0000191.</w:t>
+      </w:r>
+    </w:p>
+    <w:p>
+      <w:pPr>
+        <w:spacing w:after="80"/>
+        <w:ind w:left="397" w:hanging="397"/>
+      </w:pPr>
+      <w:r>
+        <w:rPr>
+          <w:rFonts w:ascii="Times New Roman" w:hAnsi="Times New Roman"/>
+          <w:sz w:val="20"/>
+        </w:rPr>
+        <w:t>40. Cervin M, Veas A, Piqueras JA, Martínez-González AE. A multi-group confirmatory factor analysis of the revised children's anxiety and depression scale (RCADS) in Spain, Chile and Sweden. J Affect Disord. 2022;310:228-234. PMID: 35561880.</w:t>
+      </w:r>
+    </w:p>
+    <w:p>
+      <w:pPr>
         <w:spacing w:before="280" w:after="60"/>
       </w:pPr>
       <w:r>

</xml_diff>